<commit_message>
fix(1.4): shorten table-cell underscores to prevent .docx wrap
</commit_message>
<xml_diff>
--- a/frontend/public/resources/1.4-annual-mtss-calendar.docx
+++ b/frontend/public/resources/1.4-annual-mtss-calendar.docx
@@ -521,29 +521,29 @@
               <w:pStyle w:val="Compact"/>
             </w:pPr>
             <w:r>
-              <w:t xml:space="preserve">____________</w:t>
-            </w:r>
-          </w:p>
-        </w:tc>
-        <w:tc>
-          <w:tcPr/>
-          <w:p>
-            <w:pPr>
-              <w:pStyle w:val="Compact"/>
-            </w:pPr>
-            <w:r>
-              <w:t xml:space="preserve">____________</w:t>
-            </w:r>
-          </w:p>
-        </w:tc>
-        <w:tc>
-          <w:tcPr/>
-          <w:p>
-            <w:pPr>
-              <w:pStyle w:val="Compact"/>
-            </w:pPr>
-            <w:r>
-              <w:t xml:space="preserve">____________</w:t>
+              <w:t xml:space="preserve">______</w:t>
+            </w:r>
+          </w:p>
+        </w:tc>
+        <w:tc>
+          <w:tcPr/>
+          <w:p>
+            <w:pPr>
+              <w:pStyle w:val="Compact"/>
+            </w:pPr>
+            <w:r>
+              <w:t xml:space="preserve">______</w:t>
+            </w:r>
+          </w:p>
+        </w:tc>
+        <w:tc>
+          <w:tcPr/>
+          <w:p>
+            <w:pPr>
+              <w:pStyle w:val="Compact"/>
+            </w:pPr>
+            <w:r>
+              <w:t xml:space="preserve">______</w:t>
             </w:r>
           </w:p>
         </w:tc>
@@ -578,29 +578,29 @@
               <w:pStyle w:val="Compact"/>
             </w:pPr>
             <w:r>
-              <w:t xml:space="preserve">____________</w:t>
-            </w:r>
-          </w:p>
-        </w:tc>
-        <w:tc>
-          <w:tcPr/>
-          <w:p>
-            <w:pPr>
-              <w:pStyle w:val="Compact"/>
-            </w:pPr>
-            <w:r>
-              <w:t xml:space="preserve">____________</w:t>
-            </w:r>
-          </w:p>
-        </w:tc>
-        <w:tc>
-          <w:tcPr/>
-          <w:p>
-            <w:pPr>
-              <w:pStyle w:val="Compact"/>
-            </w:pPr>
-            <w:r>
-              <w:t xml:space="preserve">____________</w:t>
+              <w:t xml:space="preserve">______</w:t>
+            </w:r>
+          </w:p>
+        </w:tc>
+        <w:tc>
+          <w:tcPr/>
+          <w:p>
+            <w:pPr>
+              <w:pStyle w:val="Compact"/>
+            </w:pPr>
+            <w:r>
+              <w:t xml:space="preserve">______</w:t>
+            </w:r>
+          </w:p>
+        </w:tc>
+        <w:tc>
+          <w:tcPr/>
+          <w:p>
+            <w:pPr>
+              <w:pStyle w:val="Compact"/>
+            </w:pPr>
+            <w:r>
+              <w:t xml:space="preserve">______</w:t>
             </w:r>
           </w:p>
         </w:tc>
@@ -635,29 +635,29 @@
               <w:pStyle w:val="Compact"/>
             </w:pPr>
             <w:r>
-              <w:t xml:space="preserve">____________</w:t>
-            </w:r>
-          </w:p>
-        </w:tc>
-        <w:tc>
-          <w:tcPr/>
-          <w:p>
-            <w:pPr>
-              <w:pStyle w:val="Compact"/>
-            </w:pPr>
-            <w:r>
-              <w:t xml:space="preserve">____________</w:t>
-            </w:r>
-          </w:p>
-        </w:tc>
-        <w:tc>
-          <w:tcPr/>
-          <w:p>
-            <w:pPr>
-              <w:pStyle w:val="Compact"/>
-            </w:pPr>
-            <w:r>
-              <w:t xml:space="preserve">____________</w:t>
+              <w:t xml:space="preserve">______</w:t>
+            </w:r>
+          </w:p>
+        </w:tc>
+        <w:tc>
+          <w:tcPr/>
+          <w:p>
+            <w:pPr>
+              <w:pStyle w:val="Compact"/>
+            </w:pPr>
+            <w:r>
+              <w:t xml:space="preserve">______</w:t>
+            </w:r>
+          </w:p>
+        </w:tc>
+        <w:tc>
+          <w:tcPr/>
+          <w:p>
+            <w:pPr>
+              <w:pStyle w:val="Compact"/>
+            </w:pPr>
+            <w:r>
+              <w:t xml:space="preserve">______</w:t>
             </w:r>
           </w:p>
         </w:tc>
@@ -692,29 +692,29 @@
               <w:pStyle w:val="Compact"/>
             </w:pPr>
             <w:r>
-              <w:t xml:space="preserve">____________</w:t>
-            </w:r>
-          </w:p>
-        </w:tc>
-        <w:tc>
-          <w:tcPr/>
-          <w:p>
-            <w:pPr>
-              <w:pStyle w:val="Compact"/>
-            </w:pPr>
-            <w:r>
-              <w:t xml:space="preserve">____________</w:t>
-            </w:r>
-          </w:p>
-        </w:tc>
-        <w:tc>
-          <w:tcPr/>
-          <w:p>
-            <w:pPr>
-              <w:pStyle w:val="Compact"/>
-            </w:pPr>
-            <w:r>
-              <w:t xml:space="preserve">____________</w:t>
+              <w:t xml:space="preserve">______</w:t>
+            </w:r>
+          </w:p>
+        </w:tc>
+        <w:tc>
+          <w:tcPr/>
+          <w:p>
+            <w:pPr>
+              <w:pStyle w:val="Compact"/>
+            </w:pPr>
+            <w:r>
+              <w:t xml:space="preserve">______</w:t>
+            </w:r>
+          </w:p>
+        </w:tc>
+        <w:tc>
+          <w:tcPr/>
+          <w:p>
+            <w:pPr>
+              <w:pStyle w:val="Compact"/>
+            </w:pPr>
+            <w:r>
+              <w:t xml:space="preserve">______</w:t>
             </w:r>
           </w:p>
         </w:tc>
@@ -749,29 +749,29 @@
               <w:pStyle w:val="Compact"/>
             </w:pPr>
             <w:r>
-              <w:t xml:space="preserve">____________</w:t>
-            </w:r>
-          </w:p>
-        </w:tc>
-        <w:tc>
-          <w:tcPr/>
-          <w:p>
-            <w:pPr>
-              <w:pStyle w:val="Compact"/>
-            </w:pPr>
-            <w:r>
-              <w:t xml:space="preserve">____________</w:t>
-            </w:r>
-          </w:p>
-        </w:tc>
-        <w:tc>
-          <w:tcPr/>
-          <w:p>
-            <w:pPr>
-              <w:pStyle w:val="Compact"/>
-            </w:pPr>
-            <w:r>
-              <w:t xml:space="preserve">____________</w:t>
+              <w:t xml:space="preserve">______</w:t>
+            </w:r>
+          </w:p>
+        </w:tc>
+        <w:tc>
+          <w:tcPr/>
+          <w:p>
+            <w:pPr>
+              <w:pStyle w:val="Compact"/>
+            </w:pPr>
+            <w:r>
+              <w:t xml:space="preserve">______</w:t>
+            </w:r>
+          </w:p>
+        </w:tc>
+        <w:tc>
+          <w:tcPr/>
+          <w:p>
+            <w:pPr>
+              <w:pStyle w:val="Compact"/>
+            </w:pPr>
+            <w:r>
+              <w:t xml:space="preserve">______</w:t>
             </w:r>
           </w:p>
         </w:tc>
@@ -806,29 +806,29 @@
               <w:pStyle w:val="Compact"/>
             </w:pPr>
             <w:r>
-              <w:t xml:space="preserve">____________</w:t>
-            </w:r>
-          </w:p>
-        </w:tc>
-        <w:tc>
-          <w:tcPr/>
-          <w:p>
-            <w:pPr>
-              <w:pStyle w:val="Compact"/>
-            </w:pPr>
-            <w:r>
-              <w:t xml:space="preserve">____________</w:t>
-            </w:r>
-          </w:p>
-        </w:tc>
-        <w:tc>
-          <w:tcPr/>
-          <w:p>
-            <w:pPr>
-              <w:pStyle w:val="Compact"/>
-            </w:pPr>
-            <w:r>
-              <w:t xml:space="preserve">____________</w:t>
+              <w:t xml:space="preserve">______</w:t>
+            </w:r>
+          </w:p>
+        </w:tc>
+        <w:tc>
+          <w:tcPr/>
+          <w:p>
+            <w:pPr>
+              <w:pStyle w:val="Compact"/>
+            </w:pPr>
+            <w:r>
+              <w:t xml:space="preserve">______</w:t>
+            </w:r>
+          </w:p>
+        </w:tc>
+        <w:tc>
+          <w:tcPr/>
+          <w:p>
+            <w:pPr>
+              <w:pStyle w:val="Compact"/>
+            </w:pPr>
+            <w:r>
+              <w:t xml:space="preserve">______</w:t>
             </w:r>
           </w:p>
         </w:tc>
@@ -863,29 +863,29 @@
               <w:pStyle w:val="Compact"/>
             </w:pPr>
             <w:r>
-              <w:t xml:space="preserve">____________</w:t>
-            </w:r>
-          </w:p>
-        </w:tc>
-        <w:tc>
-          <w:tcPr/>
-          <w:p>
-            <w:pPr>
-              <w:pStyle w:val="Compact"/>
-            </w:pPr>
-            <w:r>
-              <w:t xml:space="preserve">____________</w:t>
-            </w:r>
-          </w:p>
-        </w:tc>
-        <w:tc>
-          <w:tcPr/>
-          <w:p>
-            <w:pPr>
-              <w:pStyle w:val="Compact"/>
-            </w:pPr>
-            <w:r>
-              <w:t xml:space="preserve">____________</w:t>
+              <w:t xml:space="preserve">______</w:t>
+            </w:r>
+          </w:p>
+        </w:tc>
+        <w:tc>
+          <w:tcPr/>
+          <w:p>
+            <w:pPr>
+              <w:pStyle w:val="Compact"/>
+            </w:pPr>
+            <w:r>
+              <w:t xml:space="preserve">______</w:t>
+            </w:r>
+          </w:p>
+        </w:tc>
+        <w:tc>
+          <w:tcPr/>
+          <w:p>
+            <w:pPr>
+              <w:pStyle w:val="Compact"/>
+            </w:pPr>
+            <w:r>
+              <w:t xml:space="preserve">______</w:t>
             </w:r>
           </w:p>
         </w:tc>
@@ -920,29 +920,29 @@
               <w:pStyle w:val="Compact"/>
             </w:pPr>
             <w:r>
-              <w:t xml:space="preserve">____________</w:t>
-            </w:r>
-          </w:p>
-        </w:tc>
-        <w:tc>
-          <w:tcPr/>
-          <w:p>
-            <w:pPr>
-              <w:pStyle w:val="Compact"/>
-            </w:pPr>
-            <w:r>
-              <w:t xml:space="preserve">____________</w:t>
-            </w:r>
-          </w:p>
-        </w:tc>
-        <w:tc>
-          <w:tcPr/>
-          <w:p>
-            <w:pPr>
-              <w:pStyle w:val="Compact"/>
-            </w:pPr>
-            <w:r>
-              <w:t xml:space="preserve">____________</w:t>
+              <w:t xml:space="preserve">______</w:t>
+            </w:r>
+          </w:p>
+        </w:tc>
+        <w:tc>
+          <w:tcPr/>
+          <w:p>
+            <w:pPr>
+              <w:pStyle w:val="Compact"/>
+            </w:pPr>
+            <w:r>
+              <w:t xml:space="preserve">______</w:t>
+            </w:r>
+          </w:p>
+        </w:tc>
+        <w:tc>
+          <w:tcPr/>
+          <w:p>
+            <w:pPr>
+              <w:pStyle w:val="Compact"/>
+            </w:pPr>
+            <w:r>
+              <w:t xml:space="preserve">______</w:t>
             </w:r>
           </w:p>
         </w:tc>
@@ -977,29 +977,29 @@
               <w:pStyle w:val="Compact"/>
             </w:pPr>
             <w:r>
-              <w:t xml:space="preserve">____________</w:t>
-            </w:r>
-          </w:p>
-        </w:tc>
-        <w:tc>
-          <w:tcPr/>
-          <w:p>
-            <w:pPr>
-              <w:pStyle w:val="Compact"/>
-            </w:pPr>
-            <w:r>
-              <w:t xml:space="preserve">____________</w:t>
-            </w:r>
-          </w:p>
-        </w:tc>
-        <w:tc>
-          <w:tcPr/>
-          <w:p>
-            <w:pPr>
-              <w:pStyle w:val="Compact"/>
-            </w:pPr>
-            <w:r>
-              <w:t xml:space="preserve">____________</w:t>
+              <w:t xml:space="preserve">______</w:t>
+            </w:r>
+          </w:p>
+        </w:tc>
+        <w:tc>
+          <w:tcPr/>
+          <w:p>
+            <w:pPr>
+              <w:pStyle w:val="Compact"/>
+            </w:pPr>
+            <w:r>
+              <w:t xml:space="preserve">______</w:t>
+            </w:r>
+          </w:p>
+        </w:tc>
+        <w:tc>
+          <w:tcPr/>
+          <w:p>
+            <w:pPr>
+              <w:pStyle w:val="Compact"/>
+            </w:pPr>
+            <w:r>
+              <w:t xml:space="preserve">______</w:t>
             </w:r>
           </w:p>
         </w:tc>
@@ -1034,29 +1034,29 @@
               <w:pStyle w:val="Compact"/>
             </w:pPr>
             <w:r>
-              <w:t xml:space="preserve">____________</w:t>
-            </w:r>
-          </w:p>
-        </w:tc>
-        <w:tc>
-          <w:tcPr/>
-          <w:p>
-            <w:pPr>
-              <w:pStyle w:val="Compact"/>
-            </w:pPr>
-            <w:r>
-              <w:t xml:space="preserve">____________</w:t>
-            </w:r>
-          </w:p>
-        </w:tc>
-        <w:tc>
-          <w:tcPr/>
-          <w:p>
-            <w:pPr>
-              <w:pStyle w:val="Compact"/>
-            </w:pPr>
-            <w:r>
-              <w:t xml:space="preserve">____________</w:t>
+              <w:t xml:space="preserve">______</w:t>
+            </w:r>
+          </w:p>
+        </w:tc>
+        <w:tc>
+          <w:tcPr/>
+          <w:p>
+            <w:pPr>
+              <w:pStyle w:val="Compact"/>
+            </w:pPr>
+            <w:r>
+              <w:t xml:space="preserve">______</w:t>
+            </w:r>
+          </w:p>
+        </w:tc>
+        <w:tc>
+          <w:tcPr/>
+          <w:p>
+            <w:pPr>
+              <w:pStyle w:val="Compact"/>
+            </w:pPr>
+            <w:r>
+              <w:t xml:space="preserve">______</w:t>
             </w:r>
           </w:p>
         </w:tc>
@@ -1273,40 +1273,40 @@
               <w:pStyle w:val="Compact"/>
             </w:pPr>
             <w:r>
-              <w:t xml:space="preserve">____________</w:t>
-            </w:r>
-          </w:p>
-        </w:tc>
-        <w:tc>
-          <w:tcPr/>
-          <w:p>
-            <w:pPr>
-              <w:pStyle w:val="Compact"/>
-            </w:pPr>
-            <w:r>
-              <w:t xml:space="preserve">____________</w:t>
-            </w:r>
-          </w:p>
-        </w:tc>
-        <w:tc>
-          <w:tcPr/>
-          <w:p>
-            <w:pPr>
-              <w:pStyle w:val="Compact"/>
-            </w:pPr>
-            <w:r>
-              <w:t xml:space="preserve">____________</w:t>
-            </w:r>
-          </w:p>
-        </w:tc>
-        <w:tc>
-          <w:tcPr/>
-          <w:p>
-            <w:pPr>
-              <w:pStyle w:val="Compact"/>
-            </w:pPr>
-            <w:r>
-              <w:t xml:space="preserve">____________</w:t>
+              <w:t xml:space="preserve">______</w:t>
+            </w:r>
+          </w:p>
+        </w:tc>
+        <w:tc>
+          <w:tcPr/>
+          <w:p>
+            <w:pPr>
+              <w:pStyle w:val="Compact"/>
+            </w:pPr>
+            <w:r>
+              <w:t xml:space="preserve">______</w:t>
+            </w:r>
+          </w:p>
+        </w:tc>
+        <w:tc>
+          <w:tcPr/>
+          <w:p>
+            <w:pPr>
+              <w:pStyle w:val="Compact"/>
+            </w:pPr>
+            <w:r>
+              <w:t xml:space="preserve">______</w:t>
+            </w:r>
+          </w:p>
+        </w:tc>
+        <w:tc>
+          <w:tcPr/>
+          <w:p>
+            <w:pPr>
+              <w:pStyle w:val="Compact"/>
+            </w:pPr>
+            <w:r>
+              <w:t xml:space="preserve">______</w:t>
             </w:r>
           </w:p>
         </w:tc>
@@ -1319,40 +1319,40 @@
               <w:pStyle w:val="Compact"/>
             </w:pPr>
             <w:r>
-              <w:t xml:space="preserve">____________</w:t>
-            </w:r>
-          </w:p>
-        </w:tc>
-        <w:tc>
-          <w:tcPr/>
-          <w:p>
-            <w:pPr>
-              <w:pStyle w:val="Compact"/>
-            </w:pPr>
-            <w:r>
-              <w:t xml:space="preserve">____________</w:t>
-            </w:r>
-          </w:p>
-        </w:tc>
-        <w:tc>
-          <w:tcPr/>
-          <w:p>
-            <w:pPr>
-              <w:pStyle w:val="Compact"/>
-            </w:pPr>
-            <w:r>
-              <w:t xml:space="preserve">____________</w:t>
-            </w:r>
-          </w:p>
-        </w:tc>
-        <w:tc>
-          <w:tcPr/>
-          <w:p>
-            <w:pPr>
-              <w:pStyle w:val="Compact"/>
-            </w:pPr>
-            <w:r>
-              <w:t xml:space="preserve">____________</w:t>
+              <w:t xml:space="preserve">______</w:t>
+            </w:r>
+          </w:p>
+        </w:tc>
+        <w:tc>
+          <w:tcPr/>
+          <w:p>
+            <w:pPr>
+              <w:pStyle w:val="Compact"/>
+            </w:pPr>
+            <w:r>
+              <w:t xml:space="preserve">______</w:t>
+            </w:r>
+          </w:p>
+        </w:tc>
+        <w:tc>
+          <w:tcPr/>
+          <w:p>
+            <w:pPr>
+              <w:pStyle w:val="Compact"/>
+            </w:pPr>
+            <w:r>
+              <w:t xml:space="preserve">______</w:t>
+            </w:r>
+          </w:p>
+        </w:tc>
+        <w:tc>
+          <w:tcPr/>
+          <w:p>
+            <w:pPr>
+              <w:pStyle w:val="Compact"/>
+            </w:pPr>
+            <w:r>
+              <w:t xml:space="preserve">______</w:t>
             </w:r>
           </w:p>
         </w:tc>
@@ -1365,40 +1365,40 @@
               <w:pStyle w:val="Compact"/>
             </w:pPr>
             <w:r>
-              <w:t xml:space="preserve">____________</w:t>
-            </w:r>
-          </w:p>
-        </w:tc>
-        <w:tc>
-          <w:tcPr/>
-          <w:p>
-            <w:pPr>
-              <w:pStyle w:val="Compact"/>
-            </w:pPr>
-            <w:r>
-              <w:t xml:space="preserve">____________</w:t>
-            </w:r>
-          </w:p>
-        </w:tc>
-        <w:tc>
-          <w:tcPr/>
-          <w:p>
-            <w:pPr>
-              <w:pStyle w:val="Compact"/>
-            </w:pPr>
-            <w:r>
-              <w:t xml:space="preserve">____________</w:t>
-            </w:r>
-          </w:p>
-        </w:tc>
-        <w:tc>
-          <w:tcPr/>
-          <w:p>
-            <w:pPr>
-              <w:pStyle w:val="Compact"/>
-            </w:pPr>
-            <w:r>
-              <w:t xml:space="preserve">____________</w:t>
+              <w:t xml:space="preserve">______</w:t>
+            </w:r>
+          </w:p>
+        </w:tc>
+        <w:tc>
+          <w:tcPr/>
+          <w:p>
+            <w:pPr>
+              <w:pStyle w:val="Compact"/>
+            </w:pPr>
+            <w:r>
+              <w:t xml:space="preserve">______</w:t>
+            </w:r>
+          </w:p>
+        </w:tc>
+        <w:tc>
+          <w:tcPr/>
+          <w:p>
+            <w:pPr>
+              <w:pStyle w:val="Compact"/>
+            </w:pPr>
+            <w:r>
+              <w:t xml:space="preserve">______</w:t>
+            </w:r>
+          </w:p>
+        </w:tc>
+        <w:tc>
+          <w:tcPr/>
+          <w:p>
+            <w:pPr>
+              <w:pStyle w:val="Compact"/>
+            </w:pPr>
+            <w:r>
+              <w:t xml:space="preserve">______</w:t>
             </w:r>
           </w:p>
         </w:tc>
@@ -1411,40 +1411,40 @@
               <w:pStyle w:val="Compact"/>
             </w:pPr>
             <w:r>
-              <w:t xml:space="preserve">____________</w:t>
-            </w:r>
-          </w:p>
-        </w:tc>
-        <w:tc>
-          <w:tcPr/>
-          <w:p>
-            <w:pPr>
-              <w:pStyle w:val="Compact"/>
-            </w:pPr>
-            <w:r>
-              <w:t xml:space="preserve">____________</w:t>
-            </w:r>
-          </w:p>
-        </w:tc>
-        <w:tc>
-          <w:tcPr/>
-          <w:p>
-            <w:pPr>
-              <w:pStyle w:val="Compact"/>
-            </w:pPr>
-            <w:r>
-              <w:t xml:space="preserve">____________</w:t>
-            </w:r>
-          </w:p>
-        </w:tc>
-        <w:tc>
-          <w:tcPr/>
-          <w:p>
-            <w:pPr>
-              <w:pStyle w:val="Compact"/>
-            </w:pPr>
-            <w:r>
-              <w:t xml:space="preserve">____________</w:t>
+              <w:t xml:space="preserve">______</w:t>
+            </w:r>
+          </w:p>
+        </w:tc>
+        <w:tc>
+          <w:tcPr/>
+          <w:p>
+            <w:pPr>
+              <w:pStyle w:val="Compact"/>
+            </w:pPr>
+            <w:r>
+              <w:t xml:space="preserve">______</w:t>
+            </w:r>
+          </w:p>
+        </w:tc>
+        <w:tc>
+          <w:tcPr/>
+          <w:p>
+            <w:pPr>
+              <w:pStyle w:val="Compact"/>
+            </w:pPr>
+            <w:r>
+              <w:t xml:space="preserve">______</w:t>
+            </w:r>
+          </w:p>
+        </w:tc>
+        <w:tc>
+          <w:tcPr/>
+          <w:p>
+            <w:pPr>
+              <w:pStyle w:val="Compact"/>
+            </w:pPr>
+            <w:r>
+              <w:t xml:space="preserve">______</w:t>
             </w:r>
           </w:p>
         </w:tc>
@@ -1457,40 +1457,40 @@
               <w:pStyle w:val="Compact"/>
             </w:pPr>
             <w:r>
-              <w:t xml:space="preserve">____________</w:t>
-            </w:r>
-          </w:p>
-        </w:tc>
-        <w:tc>
-          <w:tcPr/>
-          <w:p>
-            <w:pPr>
-              <w:pStyle w:val="Compact"/>
-            </w:pPr>
-            <w:r>
-              <w:t xml:space="preserve">____________</w:t>
-            </w:r>
-          </w:p>
-        </w:tc>
-        <w:tc>
-          <w:tcPr/>
-          <w:p>
-            <w:pPr>
-              <w:pStyle w:val="Compact"/>
-            </w:pPr>
-            <w:r>
-              <w:t xml:space="preserve">____________</w:t>
-            </w:r>
-          </w:p>
-        </w:tc>
-        <w:tc>
-          <w:tcPr/>
-          <w:p>
-            <w:pPr>
-              <w:pStyle w:val="Compact"/>
-            </w:pPr>
-            <w:r>
-              <w:t xml:space="preserve">____________</w:t>
+              <w:t xml:space="preserve">______</w:t>
+            </w:r>
+          </w:p>
+        </w:tc>
+        <w:tc>
+          <w:tcPr/>
+          <w:p>
+            <w:pPr>
+              <w:pStyle w:val="Compact"/>
+            </w:pPr>
+            <w:r>
+              <w:t xml:space="preserve">______</w:t>
+            </w:r>
+          </w:p>
+        </w:tc>
+        <w:tc>
+          <w:tcPr/>
+          <w:p>
+            <w:pPr>
+              <w:pStyle w:val="Compact"/>
+            </w:pPr>
+            <w:r>
+              <w:t xml:space="preserve">______</w:t>
+            </w:r>
+          </w:p>
+        </w:tc>
+        <w:tc>
+          <w:tcPr/>
+          <w:p>
+            <w:pPr>
+              <w:pStyle w:val="Compact"/>
+            </w:pPr>
+            <w:r>
+              <w:t xml:space="preserve">______</w:t>
             </w:r>
           </w:p>
         </w:tc>
@@ -1617,8 +1617,7 @@
     <w:tbl>
       <w:tblPr>
         <w:tblStyle w:val="Table"/>
-        <w:tblW w:type="pct" w:w="5000"/>
-        <w:tblLayout w:type="fixed"/>
+        <w:tblW w:type="auto" w:w="0"/>
         <w:tblLook w:firstRow="1" w:lastRow="0" w:firstColumn="0" w:lastColumn="0" w:noHBand="0" w:noVBand="0" w:val="0020"/>
       </w:tblPr>
       <w:tblGrid>
@@ -1719,51 +1718,51 @@
               <w:pStyle w:val="Compact"/>
             </w:pPr>
             <w:r>
-              <w:t xml:space="preserve">____________</w:t>
-            </w:r>
-          </w:p>
-        </w:tc>
-        <w:tc>
-          <w:tcPr/>
-          <w:p>
-            <w:pPr>
-              <w:pStyle w:val="Compact"/>
-            </w:pPr>
-            <w:r>
-              <w:t xml:space="preserve">____________</w:t>
-            </w:r>
-          </w:p>
-        </w:tc>
-        <w:tc>
-          <w:tcPr/>
-          <w:p>
-            <w:pPr>
-              <w:pStyle w:val="Compact"/>
-            </w:pPr>
-            <w:r>
-              <w:t xml:space="preserve">____________</w:t>
-            </w:r>
-          </w:p>
-        </w:tc>
-        <w:tc>
-          <w:tcPr/>
-          <w:p>
-            <w:pPr>
-              <w:pStyle w:val="Compact"/>
-            </w:pPr>
-            <w:r>
-              <w:t xml:space="preserve">____________</w:t>
-            </w:r>
-          </w:p>
-        </w:tc>
-        <w:tc>
-          <w:tcPr/>
-          <w:p>
-            <w:pPr>
-              <w:pStyle w:val="Compact"/>
-            </w:pPr>
-            <w:r>
-              <w:t xml:space="preserve">____________</w:t>
+              <w:t xml:space="preserve">______</w:t>
+            </w:r>
+          </w:p>
+        </w:tc>
+        <w:tc>
+          <w:tcPr/>
+          <w:p>
+            <w:pPr>
+              <w:pStyle w:val="Compact"/>
+            </w:pPr>
+            <w:r>
+              <w:t xml:space="preserve">______</w:t>
+            </w:r>
+          </w:p>
+        </w:tc>
+        <w:tc>
+          <w:tcPr/>
+          <w:p>
+            <w:pPr>
+              <w:pStyle w:val="Compact"/>
+            </w:pPr>
+            <w:r>
+              <w:t xml:space="preserve">______</w:t>
+            </w:r>
+          </w:p>
+        </w:tc>
+        <w:tc>
+          <w:tcPr/>
+          <w:p>
+            <w:pPr>
+              <w:pStyle w:val="Compact"/>
+            </w:pPr>
+            <w:r>
+              <w:t xml:space="preserve">______</w:t>
+            </w:r>
+          </w:p>
+        </w:tc>
+        <w:tc>
+          <w:tcPr/>
+          <w:p>
+            <w:pPr>
+              <w:pStyle w:val="Compact"/>
+            </w:pPr>
+            <w:r>
+              <w:t xml:space="preserve">______</w:t>
             </w:r>
           </w:p>
         </w:tc>
@@ -1787,51 +1786,51 @@
               <w:pStyle w:val="Compact"/>
             </w:pPr>
             <w:r>
-              <w:t xml:space="preserve">____________</w:t>
-            </w:r>
-          </w:p>
-        </w:tc>
-        <w:tc>
-          <w:tcPr/>
-          <w:p>
-            <w:pPr>
-              <w:pStyle w:val="Compact"/>
-            </w:pPr>
-            <w:r>
-              <w:t xml:space="preserve">____________</w:t>
-            </w:r>
-          </w:p>
-        </w:tc>
-        <w:tc>
-          <w:tcPr/>
-          <w:p>
-            <w:pPr>
-              <w:pStyle w:val="Compact"/>
-            </w:pPr>
-            <w:r>
-              <w:t xml:space="preserve">____________</w:t>
-            </w:r>
-          </w:p>
-        </w:tc>
-        <w:tc>
-          <w:tcPr/>
-          <w:p>
-            <w:pPr>
-              <w:pStyle w:val="Compact"/>
-            </w:pPr>
-            <w:r>
-              <w:t xml:space="preserve">____________</w:t>
-            </w:r>
-          </w:p>
-        </w:tc>
-        <w:tc>
-          <w:tcPr/>
-          <w:p>
-            <w:pPr>
-              <w:pStyle w:val="Compact"/>
-            </w:pPr>
-            <w:r>
-              <w:t xml:space="preserve">____________</w:t>
+              <w:t xml:space="preserve">______</w:t>
+            </w:r>
+          </w:p>
+        </w:tc>
+        <w:tc>
+          <w:tcPr/>
+          <w:p>
+            <w:pPr>
+              <w:pStyle w:val="Compact"/>
+            </w:pPr>
+            <w:r>
+              <w:t xml:space="preserve">______</w:t>
+            </w:r>
+          </w:p>
+        </w:tc>
+        <w:tc>
+          <w:tcPr/>
+          <w:p>
+            <w:pPr>
+              <w:pStyle w:val="Compact"/>
+            </w:pPr>
+            <w:r>
+              <w:t xml:space="preserve">______</w:t>
+            </w:r>
+          </w:p>
+        </w:tc>
+        <w:tc>
+          <w:tcPr/>
+          <w:p>
+            <w:pPr>
+              <w:pStyle w:val="Compact"/>
+            </w:pPr>
+            <w:r>
+              <w:t xml:space="preserve">______</w:t>
+            </w:r>
+          </w:p>
+        </w:tc>
+        <w:tc>
+          <w:tcPr/>
+          <w:p>
+            <w:pPr>
+              <w:pStyle w:val="Compact"/>
+            </w:pPr>
+            <w:r>
+              <w:t xml:space="preserve">______</w:t>
             </w:r>
           </w:p>
         </w:tc>
@@ -1855,51 +1854,51 @@
               <w:pStyle w:val="Compact"/>
             </w:pPr>
             <w:r>
-              <w:t xml:space="preserve">____________</w:t>
-            </w:r>
-          </w:p>
-        </w:tc>
-        <w:tc>
-          <w:tcPr/>
-          <w:p>
-            <w:pPr>
-              <w:pStyle w:val="Compact"/>
-            </w:pPr>
-            <w:r>
-              <w:t xml:space="preserve">____________</w:t>
-            </w:r>
-          </w:p>
-        </w:tc>
-        <w:tc>
-          <w:tcPr/>
-          <w:p>
-            <w:pPr>
-              <w:pStyle w:val="Compact"/>
-            </w:pPr>
-            <w:r>
-              <w:t xml:space="preserve">____________</w:t>
-            </w:r>
-          </w:p>
-        </w:tc>
-        <w:tc>
-          <w:tcPr/>
-          <w:p>
-            <w:pPr>
-              <w:pStyle w:val="Compact"/>
-            </w:pPr>
-            <w:r>
-              <w:t xml:space="preserve">____________</w:t>
-            </w:r>
-          </w:p>
-        </w:tc>
-        <w:tc>
-          <w:tcPr/>
-          <w:p>
-            <w:pPr>
-              <w:pStyle w:val="Compact"/>
-            </w:pPr>
-            <w:r>
-              <w:t xml:space="preserve">____________</w:t>
+              <w:t xml:space="preserve">______</w:t>
+            </w:r>
+          </w:p>
+        </w:tc>
+        <w:tc>
+          <w:tcPr/>
+          <w:p>
+            <w:pPr>
+              <w:pStyle w:val="Compact"/>
+            </w:pPr>
+            <w:r>
+              <w:t xml:space="preserve">______</w:t>
+            </w:r>
+          </w:p>
+        </w:tc>
+        <w:tc>
+          <w:tcPr/>
+          <w:p>
+            <w:pPr>
+              <w:pStyle w:val="Compact"/>
+            </w:pPr>
+            <w:r>
+              <w:t xml:space="preserve">______</w:t>
+            </w:r>
+          </w:p>
+        </w:tc>
+        <w:tc>
+          <w:tcPr/>
+          <w:p>
+            <w:pPr>
+              <w:pStyle w:val="Compact"/>
+            </w:pPr>
+            <w:r>
+              <w:t xml:space="preserve">______</w:t>
+            </w:r>
+          </w:p>
+        </w:tc>
+        <w:tc>
+          <w:tcPr/>
+          <w:p>
+            <w:pPr>
+              <w:pStyle w:val="Compact"/>
+            </w:pPr>
+            <w:r>
+              <w:t xml:space="preserve">______</w:t>
             </w:r>
           </w:p>
         </w:tc>
@@ -1923,51 +1922,51 @@
               <w:pStyle w:val="Compact"/>
             </w:pPr>
             <w:r>
-              <w:t xml:space="preserve">____________</w:t>
-            </w:r>
-          </w:p>
-        </w:tc>
-        <w:tc>
-          <w:tcPr/>
-          <w:p>
-            <w:pPr>
-              <w:pStyle w:val="Compact"/>
-            </w:pPr>
-            <w:r>
-              <w:t xml:space="preserve">____________</w:t>
-            </w:r>
-          </w:p>
-        </w:tc>
-        <w:tc>
-          <w:tcPr/>
-          <w:p>
-            <w:pPr>
-              <w:pStyle w:val="Compact"/>
-            </w:pPr>
-            <w:r>
-              <w:t xml:space="preserve">____________</w:t>
-            </w:r>
-          </w:p>
-        </w:tc>
-        <w:tc>
-          <w:tcPr/>
-          <w:p>
-            <w:pPr>
-              <w:pStyle w:val="Compact"/>
-            </w:pPr>
-            <w:r>
-              <w:t xml:space="preserve">____________</w:t>
-            </w:r>
-          </w:p>
-        </w:tc>
-        <w:tc>
-          <w:tcPr/>
-          <w:p>
-            <w:pPr>
-              <w:pStyle w:val="Compact"/>
-            </w:pPr>
-            <w:r>
-              <w:t xml:space="preserve">____________</w:t>
+              <w:t xml:space="preserve">______</w:t>
+            </w:r>
+          </w:p>
+        </w:tc>
+        <w:tc>
+          <w:tcPr/>
+          <w:p>
+            <w:pPr>
+              <w:pStyle w:val="Compact"/>
+            </w:pPr>
+            <w:r>
+              <w:t xml:space="preserve">______</w:t>
+            </w:r>
+          </w:p>
+        </w:tc>
+        <w:tc>
+          <w:tcPr/>
+          <w:p>
+            <w:pPr>
+              <w:pStyle w:val="Compact"/>
+            </w:pPr>
+            <w:r>
+              <w:t xml:space="preserve">______</w:t>
+            </w:r>
+          </w:p>
+        </w:tc>
+        <w:tc>
+          <w:tcPr/>
+          <w:p>
+            <w:pPr>
+              <w:pStyle w:val="Compact"/>
+            </w:pPr>
+            <w:r>
+              <w:t xml:space="preserve">______</w:t>
+            </w:r>
+          </w:p>
+        </w:tc>
+        <w:tc>
+          <w:tcPr/>
+          <w:p>
+            <w:pPr>
+              <w:pStyle w:val="Compact"/>
+            </w:pPr>
+            <w:r>
+              <w:t xml:space="preserve">______</w:t>
             </w:r>
           </w:p>
         </w:tc>
@@ -1991,51 +1990,51 @@
               <w:pStyle w:val="Compact"/>
             </w:pPr>
             <w:r>
-              <w:t xml:space="preserve">____________</w:t>
-            </w:r>
-          </w:p>
-        </w:tc>
-        <w:tc>
-          <w:tcPr/>
-          <w:p>
-            <w:pPr>
-              <w:pStyle w:val="Compact"/>
-            </w:pPr>
-            <w:r>
-              <w:t xml:space="preserve">____________</w:t>
-            </w:r>
-          </w:p>
-        </w:tc>
-        <w:tc>
-          <w:tcPr/>
-          <w:p>
-            <w:pPr>
-              <w:pStyle w:val="Compact"/>
-            </w:pPr>
-            <w:r>
-              <w:t xml:space="preserve">____________</w:t>
-            </w:r>
-          </w:p>
-        </w:tc>
-        <w:tc>
-          <w:tcPr/>
-          <w:p>
-            <w:pPr>
-              <w:pStyle w:val="Compact"/>
-            </w:pPr>
-            <w:r>
-              <w:t xml:space="preserve">____________</w:t>
-            </w:r>
-          </w:p>
-        </w:tc>
-        <w:tc>
-          <w:tcPr/>
-          <w:p>
-            <w:pPr>
-              <w:pStyle w:val="Compact"/>
-            </w:pPr>
-            <w:r>
-              <w:t xml:space="preserve">____________</w:t>
+              <w:t xml:space="preserve">______</w:t>
+            </w:r>
+          </w:p>
+        </w:tc>
+        <w:tc>
+          <w:tcPr/>
+          <w:p>
+            <w:pPr>
+              <w:pStyle w:val="Compact"/>
+            </w:pPr>
+            <w:r>
+              <w:t xml:space="preserve">______</w:t>
+            </w:r>
+          </w:p>
+        </w:tc>
+        <w:tc>
+          <w:tcPr/>
+          <w:p>
+            <w:pPr>
+              <w:pStyle w:val="Compact"/>
+            </w:pPr>
+            <w:r>
+              <w:t xml:space="preserve">______</w:t>
+            </w:r>
+          </w:p>
+        </w:tc>
+        <w:tc>
+          <w:tcPr/>
+          <w:p>
+            <w:pPr>
+              <w:pStyle w:val="Compact"/>
+            </w:pPr>
+            <w:r>
+              <w:t xml:space="preserve">______</w:t>
+            </w:r>
+          </w:p>
+        </w:tc>
+        <w:tc>
+          <w:tcPr/>
+          <w:p>
+            <w:pPr>
+              <w:pStyle w:val="Compact"/>
+            </w:pPr>
+            <w:r>
+              <w:t xml:space="preserve">______</w:t>
             </w:r>
           </w:p>
         </w:tc>
@@ -2059,51 +2058,51 @@
               <w:pStyle w:val="Compact"/>
             </w:pPr>
             <w:r>
-              <w:t xml:space="preserve">____________</w:t>
-            </w:r>
-          </w:p>
-        </w:tc>
-        <w:tc>
-          <w:tcPr/>
-          <w:p>
-            <w:pPr>
-              <w:pStyle w:val="Compact"/>
-            </w:pPr>
-            <w:r>
-              <w:t xml:space="preserve">____________</w:t>
-            </w:r>
-          </w:p>
-        </w:tc>
-        <w:tc>
-          <w:tcPr/>
-          <w:p>
-            <w:pPr>
-              <w:pStyle w:val="Compact"/>
-            </w:pPr>
-            <w:r>
-              <w:t xml:space="preserve">____________</w:t>
-            </w:r>
-          </w:p>
-        </w:tc>
-        <w:tc>
-          <w:tcPr/>
-          <w:p>
-            <w:pPr>
-              <w:pStyle w:val="Compact"/>
-            </w:pPr>
-            <w:r>
-              <w:t xml:space="preserve">____________</w:t>
-            </w:r>
-          </w:p>
-        </w:tc>
-        <w:tc>
-          <w:tcPr/>
-          <w:p>
-            <w:pPr>
-              <w:pStyle w:val="Compact"/>
-            </w:pPr>
-            <w:r>
-              <w:t xml:space="preserve">____________</w:t>
+              <w:t xml:space="preserve">______</w:t>
+            </w:r>
+          </w:p>
+        </w:tc>
+        <w:tc>
+          <w:tcPr/>
+          <w:p>
+            <w:pPr>
+              <w:pStyle w:val="Compact"/>
+            </w:pPr>
+            <w:r>
+              <w:t xml:space="preserve">______</w:t>
+            </w:r>
+          </w:p>
+        </w:tc>
+        <w:tc>
+          <w:tcPr/>
+          <w:p>
+            <w:pPr>
+              <w:pStyle w:val="Compact"/>
+            </w:pPr>
+            <w:r>
+              <w:t xml:space="preserve">______</w:t>
+            </w:r>
+          </w:p>
+        </w:tc>
+        <w:tc>
+          <w:tcPr/>
+          <w:p>
+            <w:pPr>
+              <w:pStyle w:val="Compact"/>
+            </w:pPr>
+            <w:r>
+              <w:t xml:space="preserve">______</w:t>
+            </w:r>
+          </w:p>
+        </w:tc>
+        <w:tc>
+          <w:tcPr/>
+          <w:p>
+            <w:pPr>
+              <w:pStyle w:val="Compact"/>
+            </w:pPr>
+            <w:r>
+              <w:t xml:space="preserve">______</w:t>
             </w:r>
           </w:p>
         </w:tc>
@@ -2127,51 +2126,51 @@
               <w:pStyle w:val="Compact"/>
             </w:pPr>
             <w:r>
-              <w:t xml:space="preserve">____________</w:t>
-            </w:r>
-          </w:p>
-        </w:tc>
-        <w:tc>
-          <w:tcPr/>
-          <w:p>
-            <w:pPr>
-              <w:pStyle w:val="Compact"/>
-            </w:pPr>
-            <w:r>
-              <w:t xml:space="preserve">____________</w:t>
-            </w:r>
-          </w:p>
-        </w:tc>
-        <w:tc>
-          <w:tcPr/>
-          <w:p>
-            <w:pPr>
-              <w:pStyle w:val="Compact"/>
-            </w:pPr>
-            <w:r>
-              <w:t xml:space="preserve">____________</w:t>
-            </w:r>
-          </w:p>
-        </w:tc>
-        <w:tc>
-          <w:tcPr/>
-          <w:p>
-            <w:pPr>
-              <w:pStyle w:val="Compact"/>
-            </w:pPr>
-            <w:r>
-              <w:t xml:space="preserve">____________</w:t>
-            </w:r>
-          </w:p>
-        </w:tc>
-        <w:tc>
-          <w:tcPr/>
-          <w:p>
-            <w:pPr>
-              <w:pStyle w:val="Compact"/>
-            </w:pPr>
-            <w:r>
-              <w:t xml:space="preserve">____________</w:t>
+              <w:t xml:space="preserve">______</w:t>
+            </w:r>
+          </w:p>
+        </w:tc>
+        <w:tc>
+          <w:tcPr/>
+          <w:p>
+            <w:pPr>
+              <w:pStyle w:val="Compact"/>
+            </w:pPr>
+            <w:r>
+              <w:t xml:space="preserve">______</w:t>
+            </w:r>
+          </w:p>
+        </w:tc>
+        <w:tc>
+          <w:tcPr/>
+          <w:p>
+            <w:pPr>
+              <w:pStyle w:val="Compact"/>
+            </w:pPr>
+            <w:r>
+              <w:t xml:space="preserve">______</w:t>
+            </w:r>
+          </w:p>
+        </w:tc>
+        <w:tc>
+          <w:tcPr/>
+          <w:p>
+            <w:pPr>
+              <w:pStyle w:val="Compact"/>
+            </w:pPr>
+            <w:r>
+              <w:t xml:space="preserve">______</w:t>
+            </w:r>
+          </w:p>
+        </w:tc>
+        <w:tc>
+          <w:tcPr/>
+          <w:p>
+            <w:pPr>
+              <w:pStyle w:val="Compact"/>
+            </w:pPr>
+            <w:r>
+              <w:t xml:space="preserve">______</w:t>
             </w:r>
           </w:p>
         </w:tc>
@@ -2195,51 +2194,51 @@
               <w:pStyle w:val="Compact"/>
             </w:pPr>
             <w:r>
-              <w:t xml:space="preserve">____________</w:t>
-            </w:r>
-          </w:p>
-        </w:tc>
-        <w:tc>
-          <w:tcPr/>
-          <w:p>
-            <w:pPr>
-              <w:pStyle w:val="Compact"/>
-            </w:pPr>
-            <w:r>
-              <w:t xml:space="preserve">____________</w:t>
-            </w:r>
-          </w:p>
-        </w:tc>
-        <w:tc>
-          <w:tcPr/>
-          <w:p>
-            <w:pPr>
-              <w:pStyle w:val="Compact"/>
-            </w:pPr>
-            <w:r>
-              <w:t xml:space="preserve">____________</w:t>
-            </w:r>
-          </w:p>
-        </w:tc>
-        <w:tc>
-          <w:tcPr/>
-          <w:p>
-            <w:pPr>
-              <w:pStyle w:val="Compact"/>
-            </w:pPr>
-            <w:r>
-              <w:t xml:space="preserve">____________</w:t>
-            </w:r>
-          </w:p>
-        </w:tc>
-        <w:tc>
-          <w:tcPr/>
-          <w:p>
-            <w:pPr>
-              <w:pStyle w:val="Compact"/>
-            </w:pPr>
-            <w:r>
-              <w:t xml:space="preserve">____________</w:t>
+              <w:t xml:space="preserve">______</w:t>
+            </w:r>
+          </w:p>
+        </w:tc>
+        <w:tc>
+          <w:tcPr/>
+          <w:p>
+            <w:pPr>
+              <w:pStyle w:val="Compact"/>
+            </w:pPr>
+            <w:r>
+              <w:t xml:space="preserve">______</w:t>
+            </w:r>
+          </w:p>
+        </w:tc>
+        <w:tc>
+          <w:tcPr/>
+          <w:p>
+            <w:pPr>
+              <w:pStyle w:val="Compact"/>
+            </w:pPr>
+            <w:r>
+              <w:t xml:space="preserve">______</w:t>
+            </w:r>
+          </w:p>
+        </w:tc>
+        <w:tc>
+          <w:tcPr/>
+          <w:p>
+            <w:pPr>
+              <w:pStyle w:val="Compact"/>
+            </w:pPr>
+            <w:r>
+              <w:t xml:space="preserve">______</w:t>
+            </w:r>
+          </w:p>
+        </w:tc>
+        <w:tc>
+          <w:tcPr/>
+          <w:p>
+            <w:pPr>
+              <w:pStyle w:val="Compact"/>
+            </w:pPr>
+            <w:r>
+              <w:t xml:space="preserve">______</w:t>
             </w:r>
           </w:p>
         </w:tc>
@@ -2263,51 +2262,51 @@
               <w:pStyle w:val="Compact"/>
             </w:pPr>
             <w:r>
-              <w:t xml:space="preserve">____________</w:t>
-            </w:r>
-          </w:p>
-        </w:tc>
-        <w:tc>
-          <w:tcPr/>
-          <w:p>
-            <w:pPr>
-              <w:pStyle w:val="Compact"/>
-            </w:pPr>
-            <w:r>
-              <w:t xml:space="preserve">____________</w:t>
-            </w:r>
-          </w:p>
-        </w:tc>
-        <w:tc>
-          <w:tcPr/>
-          <w:p>
-            <w:pPr>
-              <w:pStyle w:val="Compact"/>
-            </w:pPr>
-            <w:r>
-              <w:t xml:space="preserve">____________</w:t>
-            </w:r>
-          </w:p>
-        </w:tc>
-        <w:tc>
-          <w:tcPr/>
-          <w:p>
-            <w:pPr>
-              <w:pStyle w:val="Compact"/>
-            </w:pPr>
-            <w:r>
-              <w:t xml:space="preserve">____________</w:t>
-            </w:r>
-          </w:p>
-        </w:tc>
-        <w:tc>
-          <w:tcPr/>
-          <w:p>
-            <w:pPr>
-              <w:pStyle w:val="Compact"/>
-            </w:pPr>
-            <w:r>
-              <w:t xml:space="preserve">____________</w:t>
+              <w:t xml:space="preserve">______</w:t>
+            </w:r>
+          </w:p>
+        </w:tc>
+        <w:tc>
+          <w:tcPr/>
+          <w:p>
+            <w:pPr>
+              <w:pStyle w:val="Compact"/>
+            </w:pPr>
+            <w:r>
+              <w:t xml:space="preserve">______</w:t>
+            </w:r>
+          </w:p>
+        </w:tc>
+        <w:tc>
+          <w:tcPr/>
+          <w:p>
+            <w:pPr>
+              <w:pStyle w:val="Compact"/>
+            </w:pPr>
+            <w:r>
+              <w:t xml:space="preserve">______</w:t>
+            </w:r>
+          </w:p>
+        </w:tc>
+        <w:tc>
+          <w:tcPr/>
+          <w:p>
+            <w:pPr>
+              <w:pStyle w:val="Compact"/>
+            </w:pPr>
+            <w:r>
+              <w:t xml:space="preserve">______</w:t>
+            </w:r>
+          </w:p>
+        </w:tc>
+        <w:tc>
+          <w:tcPr/>
+          <w:p>
+            <w:pPr>
+              <w:pStyle w:val="Compact"/>
+            </w:pPr>
+            <w:r>
+              <w:t xml:space="preserve">______</w:t>
             </w:r>
           </w:p>
         </w:tc>
@@ -2331,51 +2330,51 @@
               <w:pStyle w:val="Compact"/>
             </w:pPr>
             <w:r>
-              <w:t xml:space="preserve">____________</w:t>
-            </w:r>
-          </w:p>
-        </w:tc>
-        <w:tc>
-          <w:tcPr/>
-          <w:p>
-            <w:pPr>
-              <w:pStyle w:val="Compact"/>
-            </w:pPr>
-            <w:r>
-              <w:t xml:space="preserve">____________</w:t>
-            </w:r>
-          </w:p>
-        </w:tc>
-        <w:tc>
-          <w:tcPr/>
-          <w:p>
-            <w:pPr>
-              <w:pStyle w:val="Compact"/>
-            </w:pPr>
-            <w:r>
-              <w:t xml:space="preserve">____________</w:t>
-            </w:r>
-          </w:p>
-        </w:tc>
-        <w:tc>
-          <w:tcPr/>
-          <w:p>
-            <w:pPr>
-              <w:pStyle w:val="Compact"/>
-            </w:pPr>
-            <w:r>
-              <w:t xml:space="preserve">____________</w:t>
-            </w:r>
-          </w:p>
-        </w:tc>
-        <w:tc>
-          <w:tcPr/>
-          <w:p>
-            <w:pPr>
-              <w:pStyle w:val="Compact"/>
-            </w:pPr>
-            <w:r>
-              <w:t xml:space="preserve">____________</w:t>
+              <w:t xml:space="preserve">______</w:t>
+            </w:r>
+          </w:p>
+        </w:tc>
+        <w:tc>
+          <w:tcPr/>
+          <w:p>
+            <w:pPr>
+              <w:pStyle w:val="Compact"/>
+            </w:pPr>
+            <w:r>
+              <w:t xml:space="preserve">______</w:t>
+            </w:r>
+          </w:p>
+        </w:tc>
+        <w:tc>
+          <w:tcPr/>
+          <w:p>
+            <w:pPr>
+              <w:pStyle w:val="Compact"/>
+            </w:pPr>
+            <w:r>
+              <w:t xml:space="preserve">______</w:t>
+            </w:r>
+          </w:p>
+        </w:tc>
+        <w:tc>
+          <w:tcPr/>
+          <w:p>
+            <w:pPr>
+              <w:pStyle w:val="Compact"/>
+            </w:pPr>
+            <w:r>
+              <w:t xml:space="preserve">______</w:t>
+            </w:r>
+          </w:p>
+        </w:tc>
+        <w:tc>
+          <w:tcPr/>
+          <w:p>
+            <w:pPr>
+              <w:pStyle w:val="Compact"/>
+            </w:pPr>
+            <w:r>
+              <w:t xml:space="preserve">______</w:t>
             </w:r>
           </w:p>
         </w:tc>

</xml_diff>

<commit_message>
fix(1.4): abbreviate months in §6 summary table to prevent column wrap
</commit_message>
<xml_diff>
--- a/frontend/public/resources/1.4-annual-mtss-calendar.docx
+++ b/frontend/public/resources/1.4-annual-mtss-calendar.docx
@@ -1707,7 +1707,7 @@
               <w:pStyle w:val="Compact"/>
             </w:pPr>
             <w:r>
-              <w:t xml:space="preserve">August</w:t>
+              <w:t xml:space="preserve">Aug</w:t>
             </w:r>
           </w:p>
         </w:tc>
@@ -1775,7 +1775,7 @@
               <w:pStyle w:val="Compact"/>
             </w:pPr>
             <w:r>
-              <w:t xml:space="preserve">September</w:t>
+              <w:t xml:space="preserve">Sep</w:t>
             </w:r>
           </w:p>
         </w:tc>
@@ -1843,7 +1843,7 @@
               <w:pStyle w:val="Compact"/>
             </w:pPr>
             <w:r>
-              <w:t xml:space="preserve">October</w:t>
+              <w:t xml:space="preserve">Oct</w:t>
             </w:r>
           </w:p>
         </w:tc>
@@ -1911,7 +1911,7 @@
               <w:pStyle w:val="Compact"/>
             </w:pPr>
             <w:r>
-              <w:t xml:space="preserve">November</w:t>
+              <w:t xml:space="preserve">Nov</w:t>
             </w:r>
           </w:p>
         </w:tc>
@@ -1979,7 +1979,7 @@
               <w:pStyle w:val="Compact"/>
             </w:pPr>
             <w:r>
-              <w:t xml:space="preserve">December</w:t>
+              <w:t xml:space="preserve">Dec</w:t>
             </w:r>
           </w:p>
         </w:tc>
@@ -2047,7 +2047,7 @@
               <w:pStyle w:val="Compact"/>
             </w:pPr>
             <w:r>
-              <w:t xml:space="preserve">January</w:t>
+              <w:t xml:space="preserve">Jan</w:t>
             </w:r>
           </w:p>
         </w:tc>
@@ -2115,7 +2115,7 @@
               <w:pStyle w:val="Compact"/>
             </w:pPr>
             <w:r>
-              <w:t xml:space="preserve">February</w:t>
+              <w:t xml:space="preserve">Feb</w:t>
             </w:r>
           </w:p>
         </w:tc>
@@ -2183,7 +2183,7 @@
               <w:pStyle w:val="Compact"/>
             </w:pPr>
             <w:r>
-              <w:t xml:space="preserve">March</w:t>
+              <w:t xml:space="preserve">Mar</w:t>
             </w:r>
           </w:p>
         </w:tc>
@@ -2251,7 +2251,7 @@
               <w:pStyle w:val="Compact"/>
             </w:pPr>
             <w:r>
-              <w:t xml:space="preserve">April</w:t>
+              <w:t xml:space="preserve">Apr</w:t>
             </w:r>
           </w:p>
         </w:tc>

</xml_diff>